<commit_message>
Ajustando Templates do Oficio
</commit_message>
<xml_diff>
--- a/PythonDocx/Templates/template.docx
+++ b/PythonDocx/Templates/template.docx
@@ -451,16 +451,7 @@
           <w:sz w:val="24"/>
           <w:szCs w:val="24"/>
         </w:rPr>
-        <w:t>E</w:t>
-      </w:r>
-      <w:r>
-        <w:rPr>
-          <w:b/>
-          <w:spacing w:val="-10"/>
-          <w:sz w:val="24"/>
-          <w:szCs w:val="24"/>
-        </w:rPr>
-        <w:t>GFE</w:t>
+        <w:t>ESF</w:t>
       </w:r>
     </w:p>
     <w:p>
@@ -2198,11 +2189,13 @@
     </w:p>
     <w:p>
       <w:pPr>
-        <w:pStyle w:val="Corpodetexto"/>
-        <w:spacing w:before="50"/>
-        <w:rPr>
-          <w:sz w:val="22"/>
-          <w:szCs w:val="22"/>
+        <w:pStyle w:val="Ttulo1"/>
+        <w:ind w:left="0"/>
+        <w:jc w:val="left"/>
+        <w:rPr>
+          <w:sz w:val="24"/>
+          <w:szCs w:val="24"/>
+          <w:lang w:val="pt-BR"/>
         </w:rPr>
       </w:pPr>
     </w:p>
@@ -2215,14 +2208,6 @@
           <w:lang w:val="pt-BR"/>
         </w:rPr>
       </w:pPr>
-      <w:r>
-        <w:rPr>
-          <w:sz w:val="24"/>
-          <w:szCs w:val="24"/>
-          <w:lang w:val="pt-BR"/>
-        </w:rPr>
-        <w:t>Thiago Roberto Magalhães Veloso</w:t>
-      </w:r>
     </w:p>
     <w:p>
       <w:pPr>
@@ -2239,66 +2224,32 @@
           <w:szCs w:val="24"/>
           <w:lang w:val="pt-BR"/>
         </w:rPr>
-        <w:t>Diretor</w:t>
+        <w:t xml:space="preserve">Thiago </w:t>
+      </w:r>
+      <w:r>
+        <w:rPr>
+          <w:sz w:val="24"/>
+          <w:szCs w:val="24"/>
+          <w:lang w:val="pt-BR"/>
+        </w:rPr>
+        <w:t>Pedroso</w:t>
       </w:r>
     </w:p>
     <w:p>
       <w:pPr>
         <w:pStyle w:val="Ttulo1"/>
         <w:rPr>
+          <w:b w:val="0"/>
+          <w:bCs w:val="0"/>
           <w:sz w:val="24"/>
           <w:szCs w:val="24"/>
           <w:lang w:val="pt-BR"/>
         </w:rPr>
       </w:pPr>
-    </w:p>
-    <w:p>
-      <w:pPr>
-        <w:pStyle w:val="Ttulo1"/>
-        <w:rPr>
-          <w:sz w:val="24"/>
-          <w:szCs w:val="24"/>
-          <w:lang w:val="pt-BR"/>
-        </w:rPr>
-      </w:pPr>
-    </w:p>
-    <w:p>
-      <w:pPr>
-        <w:pStyle w:val="Ttulo1"/>
-        <w:rPr>
-          <w:sz w:val="24"/>
-          <w:szCs w:val="24"/>
-          <w:lang w:val="pt-BR"/>
-        </w:rPr>
-      </w:pPr>
-      <w:r>
-        <w:rPr>
-          <w:sz w:val="24"/>
-          <w:szCs w:val="24"/>
-          <w:lang w:val="pt-BR"/>
-        </w:rPr>
-        <w:t xml:space="preserve">Thiago </w:t>
-      </w:r>
-      <w:r>
-        <w:rPr>
-          <w:sz w:val="24"/>
-          <w:szCs w:val="24"/>
-          <w:lang w:val="pt-BR"/>
-        </w:rPr>
-        <w:t>Pedroso</w:t>
-      </w:r>
-    </w:p>
-    <w:p>
-      <w:pPr>
-        <w:pStyle w:val="Ttulo1"/>
-        <w:rPr>
-          <w:sz w:val="24"/>
-          <w:szCs w:val="24"/>
-          <w:lang w:val="pt-BR"/>
-        </w:rPr>
-      </w:pPr>
-      <w:r>
-        <w:rPr>
+      <w:r>
+        <w:rPr>
+          <w:b w:val="0"/>
+          <w:bCs w:val="0"/>
           <w:sz w:val="24"/>
           <w:szCs w:val="24"/>
           <w:lang w:val="pt-BR"/>
@@ -3132,6 +3083,26 @@
 </file>
 
 <file path=customXml/item1.xml><?xml version="1.0" encoding="utf-8"?>
+<p:properties xmlns:p="http://schemas.microsoft.com/office/2006/metadata/properties" xmlns:xsi="http://www.w3.org/2001/XMLSchema-instance" xmlns:pc="http://schemas.microsoft.com/office/infopath/2007/PartnerControls">
+  <documentManagement>
+    <TaxCatchAll xmlns="07b80e73-8c34-4c23-b1b1-175ed32c4fdd" xsi:nil="true"/>
+    <lcf76f155ced4ddcb4097134ff3c332f xmlns="2ed59c84-7814-46cc-a9c6-d8fe31e8cd81">
+      <Terms xmlns="http://schemas.microsoft.com/office/infopath/2007/PartnerControls"/>
+    </lcf76f155ced4ddcb4097134ff3c332f>
+  </documentManagement>
+</p:properties>
+</file>
+
+<file path=customXml/item2.xml><?xml version="1.0" encoding="utf-8"?>
+<?mso-contentType ?>
+<FormTemplates xmlns="http://schemas.microsoft.com/sharepoint/v3/contenttype/forms">
+  <Display>DocumentLibraryForm</Display>
+  <Edit>DocumentLibraryForm</Edit>
+  <New>DocumentLibraryForm</New>
+</FormTemplates>
+</file>
+
+<file path=customXml/item3.xml><?xml version="1.0" encoding="utf-8"?>
 <ct:contentTypeSchema xmlns:ct="http://schemas.microsoft.com/office/2006/metadata/contentType" xmlns:ma="http://schemas.microsoft.com/office/2006/metadata/properties/metaAttributes" ct:_="" ma:_="" ma:contentTypeName="Documento" ma:contentTypeID="0x01010060586302A2B79940BA99F529AB1C1D0D" ma:contentTypeVersion="13" ma:contentTypeDescription="Crie um novo documento." ma:contentTypeScope="" ma:versionID="18e009b231ad34696c6f340d05ff06aa">
   <xsd:schema xmlns:xsd="http://www.w3.org/2001/XMLSchema" xmlns:xs="http://www.w3.org/2001/XMLSchema" xmlns:p="http://schemas.microsoft.com/office/2006/metadata/properties" xmlns:ns2="2ed59c84-7814-46cc-a9c6-d8fe31e8cd81" xmlns:ns3="07b80e73-8c34-4c23-b1b1-175ed32c4fdd" targetNamespace="http://schemas.microsoft.com/office/2006/metadata/properties" ma:root="true" ma:fieldsID="cf663007b52b10af1b81be5a192879f1" ns2:_="" ns3:_="">
     <xsd:import namespace="2ed59c84-7814-46cc-a9c6-d8fe31e8cd81"/>
@@ -3338,27 +3309,26 @@
 </ct:contentTypeSchema>
 </file>
 
-<file path=customXml/item2.xml><?xml version="1.0" encoding="utf-8"?>
-<?mso-contentType ?>
-<FormTemplates xmlns="http://schemas.microsoft.com/sharepoint/v3/contenttype/forms">
-  <Display>DocumentLibraryForm</Display>
-  <Edit>DocumentLibraryForm</Edit>
-  <New>DocumentLibraryForm</New>
-</FormTemplates>
+<file path=customXml/itemProps1.xml><?xml version="1.0" encoding="utf-8"?>
+<ds:datastoreItem xmlns:ds="http://schemas.openxmlformats.org/officeDocument/2006/customXml" ds:itemID="{D8E8BCB0-8D35-4FE3-B00C-BC4C61B6B449}">
+  <ds:schemaRefs>
+    <ds:schemaRef ds:uri="http://schemas.microsoft.com/office/2006/metadata/properties"/>
+    <ds:schemaRef ds:uri="http://schemas.microsoft.com/office/infopath/2007/PartnerControls"/>
+    <ds:schemaRef ds:uri="07b80e73-8c34-4c23-b1b1-175ed32c4fdd"/>
+    <ds:schemaRef ds:uri="2ed59c84-7814-46cc-a9c6-d8fe31e8cd81"/>
+  </ds:schemaRefs>
+</ds:datastoreItem>
 </file>
 
-<file path=customXml/item3.xml><?xml version="1.0" encoding="utf-8"?>
-<p:properties xmlns:p="http://schemas.microsoft.com/office/2006/metadata/properties" xmlns:xsi="http://www.w3.org/2001/XMLSchema-instance" xmlns:pc="http://schemas.microsoft.com/office/infopath/2007/PartnerControls">
-  <documentManagement>
-    <TaxCatchAll xmlns="07b80e73-8c34-4c23-b1b1-175ed32c4fdd" xsi:nil="true"/>
-    <lcf76f155ced4ddcb4097134ff3c332f xmlns="2ed59c84-7814-46cc-a9c6-d8fe31e8cd81">
-      <Terms xmlns="http://schemas.microsoft.com/office/infopath/2007/PartnerControls"/>
-    </lcf76f155ced4ddcb4097134ff3c332f>
-  </documentManagement>
-</p:properties>
+<file path=customXml/itemProps2.xml><?xml version="1.0" encoding="utf-8"?>
+<ds:datastoreItem xmlns:ds="http://schemas.openxmlformats.org/officeDocument/2006/customXml" ds:itemID="{8D8CAE1A-8C8C-480A-A5A6-75144DF04DC1}">
+  <ds:schemaRefs>
+    <ds:schemaRef ds:uri="http://schemas.microsoft.com/sharepoint/v3/contenttype/forms"/>
+  </ds:schemaRefs>
+</ds:datastoreItem>
 </file>
 
-<file path=customXml/itemProps1.xml><?xml version="1.0" encoding="utf-8"?>
+<file path=customXml/itemProps3.xml><?xml version="1.0" encoding="utf-8"?>
 <ds:datastoreItem xmlns:ds="http://schemas.openxmlformats.org/officeDocument/2006/customXml" ds:itemID="{4EBCD8E6-B389-426E-9015-17BEC981BF7A}">
   <ds:schemaRefs>
     <ds:schemaRef ds:uri="http://schemas.microsoft.com/office/2006/metadata/contentType"/>
@@ -3375,23 +3345,4 @@
     <ds:schemaRef ds:uri="http://schemas.microsoft.com/internal/obd"/>
   </ds:schemaRefs>
 </ds:datastoreItem>
-</file>
-
-<file path=customXml/itemProps2.xml><?xml version="1.0" encoding="utf-8"?>
-<ds:datastoreItem xmlns:ds="http://schemas.openxmlformats.org/officeDocument/2006/customXml" ds:itemID="{8D8CAE1A-8C8C-480A-A5A6-75144DF04DC1}">
-  <ds:schemaRefs>
-    <ds:schemaRef ds:uri="http://schemas.microsoft.com/sharepoint/v3/contenttype/forms"/>
-  </ds:schemaRefs>
-</ds:datastoreItem>
-</file>
-
-<file path=customXml/itemProps3.xml><?xml version="1.0" encoding="utf-8"?>
-<ds:datastoreItem xmlns:ds="http://schemas.openxmlformats.org/officeDocument/2006/customXml" ds:itemID="{D8E8BCB0-8D35-4FE3-B00C-BC4C61B6B449}">
-  <ds:schemaRefs>
-    <ds:schemaRef ds:uri="http://schemas.microsoft.com/office/2006/metadata/properties"/>
-    <ds:schemaRef ds:uri="http://schemas.microsoft.com/office/infopath/2007/PartnerControls"/>
-    <ds:schemaRef ds:uri="07b80e73-8c34-4c23-b1b1-175ed32c4fdd"/>
-    <ds:schemaRef ds:uri="2ed59c84-7814-46cc-a9c6-d8fe31e8cd81"/>
-  </ds:schemaRefs>
-</ds:datastoreItem>
 </file>
</xml_diff>